<commit_message>
Blueprint: web-archive and blockchain apps; domain help names both archives (#1499)
The OSINT app blueprint gains Web archives (Sharchive, IzzyOnDroid, GPL-3.0-only -> wayback_cdx, common_crawl, archived_page via `domain DOMAIN`, Partial) and Blockchain (Mempal, F-Droid, MIT -> blockchain via `crypto BITCOIN-ADDRESS`, Partial), each with its gap and acceptance criterion. docs/OSINT_APK_BLUEPRINT.docx regenerated (21 tables). `domain --help` now names the Wayback and Common Crawl legs.

Gated with xtask gate full on the same tree; all CI green on 94459a5e.

Co-Authored-By: Claude Opus 5.5 <noreply@anthropic.com>
Claude-Session: https://claude.ai/code/session_01UV56qW3Ly33dCiwheMuHej
</commit_message>
<xml_diff>
--- a/docs/OSINT_APK_BLUEPRINT.docx
+++ b/docs/OSINT_APK_BLUEPRINT.docx
@@ -772,6 +772,80 @@
           </w:p>
         </w:tc>
       </w:tr>
+      <w:tr>
+        <w:tc>
+          <w:p>
+            <w:r>
+              <w:t xml:space="preserve">Sharchive</w:t>
+            </w:r>
+          </w:p>
+        </w:tc>
+        <w:tc>
+          <w:p>
+            <w:r>
+              <w:t xml:space="preserve">Web archives</w:t>
+            </w:r>
+          </w:p>
+        </w:tc>
+        <w:tc>
+          <w:p>
+            <w:r>
+              <w:t xml:space="preserve">P1</w:t>
+            </w:r>
+          </w:p>
+        </w:tc>
+        <w:tc>
+          <w:p>
+            <w:r>
+              <w:t xml:space="preserve">Partial</w:t>
+            </w:r>
+          </w:p>
+        </w:tc>
+        <w:tc>
+          <w:p>
+            <w:r>
+              <w:t xml:space="preserve">domain DOMAIN</w:t>
+            </w:r>
+          </w:p>
+        </w:tc>
+      </w:tr>
+      <w:tr>
+        <w:tc>
+          <w:p>
+            <w:r>
+              <w:t xml:space="preserve">Mempal</w:t>
+            </w:r>
+          </w:p>
+        </w:tc>
+        <w:tc>
+          <w:p>
+            <w:r>
+              <w:t xml:space="preserve">Blockchain</w:t>
+            </w:r>
+          </w:p>
+        </w:tc>
+        <w:tc>
+          <w:p>
+            <w:r>
+              <w:t xml:space="preserve">P3</w:t>
+            </w:r>
+          </w:p>
+        </w:tc>
+        <w:tc>
+          <w:p>
+            <w:r>
+              <w:t xml:space="preserve">Partial</w:t>
+            </w:r>
+          </w:p>
+        </w:tc>
+        <w:tc>
+          <w:p>
+            <w:r>
+              <w:t xml:space="preserve">crypto BITCOIN-ADDRESS</w:t>
+            </w:r>
+          </w:p>
+        </w:tc>
+      </w:tr>
     </w:tbl>
     <w:p/>
     <w:p>
@@ -5198,6 +5272,508 @@
           <w:p>
             <w:r>
               <w:t xml:space="preserve">exif IMAGE-FILE reads EXIF tags and GPS position from JPEG, TIFF, WebP and PNG, and refuses a corrupt file without a panic (exif tests).</w:t>
+            </w:r>
+          </w:p>
+        </w:tc>
+      </w:tr>
+    </w:tbl>
+    <w:p/>
+    <w:p>
+      <w:pPr>
+        <w:pStyle w:val="Heading1"/>
+      </w:pPr>
+      <w:r>
+        <w:t xml:space="preserve">Web archives</w:t>
+      </w:r>
+    </w:p>
+    <w:p>
+      <w:pPr>
+        <w:pStyle w:val="Heading2"/>
+      </w:pPr>
+      <w:r>
+        <w:t xml:space="preserve">Sharchive</w:t>
+      </w:r>
+    </w:p>
+    <w:tbl>
+      <w:tblPr>
+        <w:tblStyle w:val="Grid"/>
+        <w:tblW w:w="5000" w:type="pct"/>
+        <w:tblLayout w:type="fixed"/>
+      </w:tblPr>
+      <w:tblGrid>
+        <w:gridCol w:w="3443"/>
+        <w:gridCol w:w="11694"/>
+      </w:tblGrid>
+      <w:tr>
+        <w:trPr>
+          <w:tblHeader/>
+        </w:trPr>
+        <w:tc>
+          <w:tcPr>
+            <w:shd w:val="clear" w:color="auto" w:fill="E8EEF7"/>
+          </w:tcPr>
+          <w:p>
+            <w:r>
+              <w:rPr>
+                <w:b/>
+              </w:rPr>
+              <w:t xml:space="preserve">Field</w:t>
+            </w:r>
+          </w:p>
+        </w:tc>
+        <w:tc>
+          <w:tcPr>
+            <w:shd w:val="clear" w:color="auto" w:fill="E8EEF7"/>
+          </w:tcPr>
+          <w:p>
+            <w:r>
+              <w:rPr>
+                <w:b/>
+              </w:rPr>
+              <w:t xml:space="preserve">Value</w:t>
+            </w:r>
+          </w:p>
+        </w:tc>
+      </w:tr>
+      <w:tr>
+        <w:tc>
+          <w:p>
+            <w:r>
+              <w:t xml:space="preserve">Package</w:t>
+            </w:r>
+          </w:p>
+        </w:tc>
+        <w:tc>
+          <w:p>
+            <w:r>
+              <w:t xml:space="preserve">com.nudev.sharchive</w:t>
+            </w:r>
+          </w:p>
+        </w:tc>
+      </w:tr>
+      <w:tr>
+        <w:tc>
+          <w:p>
+            <w:r>
+              <w:t xml:space="preserve">Source</w:t>
+            </w:r>
+          </w:p>
+        </w:tc>
+        <w:tc>
+          <w:p>
+            <w:r>
+              <w:t xml:space="preserve">https://apt.izzysoft.de/fdroid/index/apk/com.nudev.sharchive</w:t>
+            </w:r>
+          </w:p>
+        </w:tc>
+      </w:tr>
+      <w:tr>
+        <w:tc>
+          <w:p>
+            <w:r>
+              <w:t xml:space="preserve">Licence</w:t>
+            </w:r>
+          </w:p>
+        </w:tc>
+        <w:tc>
+          <w:p>
+            <w:r>
+              <w:t xml:space="preserve">GPL-3.0-only</w:t>
+            </w:r>
+          </w:p>
+        </w:tc>
+      </w:tr>
+      <w:tr>
+        <w:tc>
+          <w:p>
+            <w:r>
+              <w:t xml:space="preserve">Features</w:t>
+            </w:r>
+          </w:p>
+        </w:tc>
+        <w:tc>
+          <w:p>
+            <w:r>
+              <w:t xml:space="preserve">Opens a shared page's history in the Internet Archive's Wayback Machine or Archive.is from the Android share sheet, and can ask Archive.org to save the page.</w:t>
+            </w:r>
+          </w:p>
+        </w:tc>
+      </w:tr>
+      <w:tr>
+        <w:tc>
+          <w:p>
+            <w:r>
+              <w:t xml:space="preserve">Rust modules</w:t>
+            </w:r>
+          </w:p>
+        </w:tc>
+        <w:tc>
+          <w:p>
+            <w:r>
+              <w:t xml:space="preserve">wayback_cdx, common_crawl, archived_page</w:t>
+            </w:r>
+          </w:p>
+        </w:tc>
+      </w:tr>
+      <w:tr>
+        <w:tc>
+          <w:p>
+            <w:r>
+              <w:t xml:space="preserve">Huntsman commands</w:t>
+            </w:r>
+          </w:p>
+        </w:tc>
+        <w:tc>
+          <w:p>
+            <w:r>
+              <w:t xml:space="preserve">domain DOMAIN</w:t>
+            </w:r>
+          </w:p>
+        </w:tc>
+      </w:tr>
+      <w:tr>
+        <w:tc>
+          <w:p>
+            <w:r>
+              <w:t xml:space="preserve">Integration</w:t>
+            </w:r>
+          </w:p>
+        </w:tc>
+        <w:tc>
+          <w:p>
+            <w:r>
+              <w:t xml:space="preserve">CLI (domain, scan -k domain), /api/lookup and the Web UI domain scan; wayback_cdx and common_crawl in the module catalogue</w:t>
+            </w:r>
+          </w:p>
+        </w:tc>
+      </w:tr>
+      <w:tr>
+        <w:tc>
+          <w:p>
+            <w:r>
+              <w:t xml:space="preserve">Termux requirements</w:t>
+            </w:r>
+          </w:p>
+        </w:tc>
+        <w:tc>
+          <w:p>
+            <w:r>
+              <w:t xml:space="preserve">None beyond Termux; keyless</w:t>
+            </w:r>
+          </w:p>
+        </w:tc>
+      </w:tr>
+      <w:tr>
+        <w:tc>
+          <w:p>
+            <w:r>
+              <w:t xml:space="preserve">Priority</w:t>
+            </w:r>
+          </w:p>
+        </w:tc>
+        <w:tc>
+          <w:p>
+            <w:r>
+              <w:t xml:space="preserve">P1</w:t>
+            </w:r>
+          </w:p>
+        </w:tc>
+      </w:tr>
+      <w:tr>
+        <w:tc>
+          <w:p>
+            <w:r>
+              <w:t xml:space="preserve">Status</w:t>
+            </w:r>
+          </w:p>
+        </w:tc>
+        <w:tc>
+          <w:p>
+            <w:r>
+              <w:t xml:space="preserve">Partial</w:t>
+            </w:r>
+          </w:p>
+        </w:tc>
+      </w:tr>
+      <w:tr>
+        <w:tc>
+          <w:p>
+            <w:r>
+              <w:t xml:space="preserve">Gap or limit</w:t>
+            </w:r>
+          </w:p>
+        </w:tc>
+        <w:tc>
+          <w:p>
+            <w:r>
+              <w:t xml:space="preserve">Huntsman reads two archives for a whole domain (the Wayback CDX index and the newest Common Crawl index) and the contacts up to three archived pages of each published; it does not query Archive.is or submit pages to Save Page Now, which would write to a third party.</w:t>
+            </w:r>
+          </w:p>
+        </w:tc>
+      </w:tr>
+      <w:tr>
+        <w:tc>
+          <w:p>
+            <w:r>
+              <w:t xml:space="preserve">Acceptance</w:t>
+            </w:r>
+          </w:p>
+        </w:tc>
+        <w:tc>
+          <w:p>
+            <w:r>
+              <w:t xml:space="preserve">domain DOMAIN reports wayback_cdx and common_crawl outcomes; a captured contact page yields historical_content leads naming the capture and archive, and an empty index is a valid zero (wayback_cdx and common_crawl tests).</w:t>
+            </w:r>
+          </w:p>
+        </w:tc>
+      </w:tr>
+    </w:tbl>
+    <w:p/>
+    <w:p>
+      <w:pPr>
+        <w:pStyle w:val="Heading1"/>
+      </w:pPr>
+      <w:r>
+        <w:t xml:space="preserve">Blockchain</w:t>
+      </w:r>
+    </w:p>
+    <w:p>
+      <w:pPr>
+        <w:pStyle w:val="Heading2"/>
+      </w:pPr>
+      <w:r>
+        <w:t xml:space="preserve">Mempal</w:t>
+      </w:r>
+    </w:p>
+    <w:tbl>
+      <w:tblPr>
+        <w:tblStyle w:val="Grid"/>
+        <w:tblW w:w="5000" w:type="pct"/>
+        <w:tblLayout w:type="fixed"/>
+      </w:tblPr>
+      <w:tblGrid>
+        <w:gridCol w:w="3443"/>
+        <w:gridCol w:w="11694"/>
+      </w:tblGrid>
+      <w:tr>
+        <w:trPr>
+          <w:tblHeader/>
+        </w:trPr>
+        <w:tc>
+          <w:tcPr>
+            <w:shd w:val="clear" w:color="auto" w:fill="E8EEF7"/>
+          </w:tcPr>
+          <w:p>
+            <w:r>
+              <w:rPr>
+                <w:b/>
+              </w:rPr>
+              <w:t xml:space="preserve">Field</w:t>
+            </w:r>
+          </w:p>
+        </w:tc>
+        <w:tc>
+          <w:tcPr>
+            <w:shd w:val="clear" w:color="auto" w:fill="E8EEF7"/>
+          </w:tcPr>
+          <w:p>
+            <w:r>
+              <w:rPr>
+                <w:b/>
+              </w:rPr>
+              <w:t xml:space="preserve">Value</w:t>
+            </w:r>
+          </w:p>
+        </w:tc>
+      </w:tr>
+      <w:tr>
+        <w:tc>
+          <w:p>
+            <w:r>
+              <w:t xml:space="preserve">Package</w:t>
+            </w:r>
+          </w:p>
+        </w:tc>
+        <w:tc>
+          <w:p>
+            <w:r>
+              <w:t xml:space="preserve">com.example.mempal</w:t>
+            </w:r>
+          </w:p>
+        </w:tc>
+      </w:tr>
+      <w:tr>
+        <w:tc>
+          <w:p>
+            <w:r>
+              <w:t xml:space="preserve">Source</w:t>
+            </w:r>
+          </w:p>
+        </w:tc>
+        <w:tc>
+          <w:p>
+            <w:r>
+              <w:t xml:space="preserve">https://f-droid.org/packages/com.example.mempal/</w:t>
+            </w:r>
+          </w:p>
+        </w:tc>
+      </w:tr>
+      <w:tr>
+        <w:tc>
+          <w:p>
+            <w:r>
+              <w:t xml:space="preserve">Licence</w:t>
+            </w:r>
+          </w:p>
+        </w:tc>
+        <w:tc>
+          <w:p>
+            <w:r>
+              <w:t xml:space="preserve">MIT</w:t>
+            </w:r>
+          </w:p>
+        </w:tc>
+      </w:tr>
+      <w:tr>
+        <w:tc>
+          <w:p>
+            <w:r>
+              <w:t xml:space="preserve">Features</w:t>
+            </w:r>
+          </w:p>
+        </w:tc>
+        <w:tc>
+          <w:p>
+            <w:r>
+              <w:t xml:space="preserve">Bitcoin network monitor: block height, hashrate, mempool size and fee rates, alerts when a TXID confirms, a fee estimator, a self-hosted mempool server option and Tor.</w:t>
+            </w:r>
+          </w:p>
+        </w:tc>
+      </w:tr>
+      <w:tr>
+        <w:tc>
+          <w:p>
+            <w:r>
+              <w:t xml:space="preserve">Rust modules</w:t>
+            </w:r>
+          </w:p>
+        </w:tc>
+        <w:tc>
+          <w:p>
+            <w:r>
+              <w:t xml:space="preserve">blockchain, crypto_cli</w:t>
+            </w:r>
+          </w:p>
+        </w:tc>
+      </w:tr>
+      <w:tr>
+        <w:tc>
+          <w:p>
+            <w:r>
+              <w:t xml:space="preserve">Huntsman commands</w:t>
+            </w:r>
+          </w:p>
+        </w:tc>
+        <w:tc>
+          <w:p>
+            <w:r>
+              <w:t xml:space="preserve">crypto BITCOIN-ADDRESS</w:t>
+            </w:r>
+          </w:p>
+        </w:tc>
+      </w:tr>
+      <w:tr>
+        <w:tc>
+          <w:p>
+            <w:r>
+              <w:t xml:space="preserve">Integration</w:t>
+            </w:r>
+          </w:p>
+        </w:tc>
+        <w:tc>
+          <w:p>
+            <w:r>
+              <w:t xml:space="preserve">CLI (crypto, scan -k crypto), /api/lookup and the Web UI's Bitcoin / Base wallet scan</w:t>
+            </w:r>
+          </w:p>
+        </w:tc>
+      </w:tr>
+      <w:tr>
+        <w:tc>
+          <w:p>
+            <w:r>
+              <w:t xml:space="preserve">Termux requirements</w:t>
+            </w:r>
+          </w:p>
+        </w:tc>
+        <w:tc>
+          <w:p>
+            <w:r>
+              <w:t xml:space="preserve">None beyond Termux; keyless</w:t>
+            </w:r>
+          </w:p>
+        </w:tc>
+      </w:tr>
+      <w:tr>
+        <w:tc>
+          <w:p>
+            <w:r>
+              <w:t xml:space="preserve">Priority</w:t>
+            </w:r>
+          </w:p>
+        </w:tc>
+        <w:tc>
+          <w:p>
+            <w:r>
+              <w:t xml:space="preserve">P3</w:t>
+            </w:r>
+          </w:p>
+        </w:tc>
+      </w:tr>
+      <w:tr>
+        <w:tc>
+          <w:p>
+            <w:r>
+              <w:t xml:space="preserve">Status</w:t>
+            </w:r>
+          </w:p>
+        </w:tc>
+        <w:tc>
+          <w:p>
+            <w:r>
+              <w:t xml:space="preserve">Partial</w:t>
+            </w:r>
+          </w:p>
+        </w:tc>
+      </w:tr>
+      <w:tr>
+        <w:tc>
+          <w:p>
+            <w:r>
+              <w:t xml:space="preserve">Gap or limit</w:t>
+            </w:r>
+          </w:p>
+        </w:tc>
+        <w:tc>
+          <w:p>
+            <w:r>
+              <w:t xml:space="preserve">Huntsman investigates an address (balance, a sampled transaction chronology and role-named counterparties), not the network: no mempool, fee or TXID-confirmation watch.</w:t>
+            </w:r>
+          </w:p>
+        </w:tc>
+      </w:tr>
+      <w:tr>
+        <w:tc>
+          <w:p>
+            <w:r>
+              <w:t xml:space="preserve">Acceptance</w:t>
+            </w:r>
+          </w:p>
+        </w:tc>
+        <w:tc>
+          <w:p>
+            <w:r>
+              <w:t xml:space="preserve">crypto BITCOIN-ADDRESS on a fictional fixture lists the sampled first and last transaction times and paid_by, paid_to and co_input counterparties, each stating that a shared transaction is not common ownership (blockchain tests).</w:t>
             </w:r>
           </w:p>
         </w:tc>

</xml_diff>

<commit_message>
docs(blueprint): aviation category with SkyPulse mapped to the OpenSky leg
SkyPulse (F-Droid io.github.mrjohn6774.skypulse, GPL-3.0-or-later)
decodes 1090 MHz ADS-B on the phone from an RTL-SDR. Huntsman's
equivalent is Partial: `geocode QUERY` with a LAT,LON reads what
OpenSky's public receiver network last reported around the point; it
does not decode from an attached SDR (which would need termux-usb and
a Mode S decoder). The command test first rejected `geocode LAT,LON`
(not geocode's synopsis), so the entry names `geocode QUERY`.
docs/OSINT_APK_BLUEPRINT.docx regenerated (22 tables).

Co-Authored-By: Claude Opus 5.5 <noreply@anthropic.com>
Claude-Session: https://claude.ai/code/session_01UV56qW3Ly33dCiwheMuHej
</commit_message>
<xml_diff>
--- a/docs/OSINT_APK_BLUEPRINT.docx
+++ b/docs/OSINT_APK_BLUEPRINT.docx
@@ -846,6 +846,43 @@
           </w:p>
         </w:tc>
       </w:tr>
+      <w:tr>
+        <w:tc>
+          <w:p>
+            <w:r>
+              <w:t xml:space="preserve">SkyPulse</w:t>
+            </w:r>
+          </w:p>
+        </w:tc>
+        <w:tc>
+          <w:p>
+            <w:r>
+              <w:t xml:space="preserve">Aviation</w:t>
+            </w:r>
+          </w:p>
+        </w:tc>
+        <w:tc>
+          <w:p>
+            <w:r>
+              <w:t xml:space="preserve">P2</w:t>
+            </w:r>
+          </w:p>
+        </w:tc>
+        <w:tc>
+          <w:p>
+            <w:r>
+              <w:t xml:space="preserve">Partial</w:t>
+            </w:r>
+          </w:p>
+        </w:tc>
+        <w:tc>
+          <w:p>
+            <w:r>
+              <w:t xml:space="preserve">geocode QUERY</w:t>
+            </w:r>
+          </w:p>
+        </w:tc>
+      </w:tr>
     </w:tbl>
     <w:p/>
     <w:p>
@@ -5774,6 +5811,257 @@
           <w:p>
             <w:r>
               <w:t xml:space="preserve">crypto BITCOIN-ADDRESS on a fictional fixture lists the sampled first and last transaction times and paid_by, paid_to and co_input counterparties, each stating that a shared transaction is not common ownership (blockchain tests).</w:t>
+            </w:r>
+          </w:p>
+        </w:tc>
+      </w:tr>
+    </w:tbl>
+    <w:p/>
+    <w:p>
+      <w:pPr>
+        <w:pStyle w:val="Heading1"/>
+      </w:pPr>
+      <w:r>
+        <w:t xml:space="preserve">Aviation</w:t>
+      </w:r>
+    </w:p>
+    <w:p>
+      <w:pPr>
+        <w:pStyle w:val="Heading2"/>
+      </w:pPr>
+      <w:r>
+        <w:t xml:space="preserve">SkyPulse</w:t>
+      </w:r>
+    </w:p>
+    <w:tbl>
+      <w:tblPr>
+        <w:tblStyle w:val="Grid"/>
+        <w:tblW w:w="5000" w:type="pct"/>
+        <w:tblLayout w:type="fixed"/>
+      </w:tblPr>
+      <w:tblGrid>
+        <w:gridCol w:w="3443"/>
+        <w:gridCol w:w="11694"/>
+      </w:tblGrid>
+      <w:tr>
+        <w:trPr>
+          <w:tblHeader/>
+        </w:trPr>
+        <w:tc>
+          <w:tcPr>
+            <w:shd w:val="clear" w:color="auto" w:fill="E8EEF7"/>
+          </w:tcPr>
+          <w:p>
+            <w:r>
+              <w:rPr>
+                <w:b/>
+              </w:rPr>
+              <w:t xml:space="preserve">Field</w:t>
+            </w:r>
+          </w:p>
+        </w:tc>
+        <w:tc>
+          <w:tcPr>
+            <w:shd w:val="clear" w:color="auto" w:fill="E8EEF7"/>
+          </w:tcPr>
+          <w:p>
+            <w:r>
+              <w:rPr>
+                <w:b/>
+              </w:rPr>
+              <w:t xml:space="preserve">Value</w:t>
+            </w:r>
+          </w:p>
+        </w:tc>
+      </w:tr>
+      <w:tr>
+        <w:tc>
+          <w:p>
+            <w:r>
+              <w:t xml:space="preserve">Package</w:t>
+            </w:r>
+          </w:p>
+        </w:tc>
+        <w:tc>
+          <w:p>
+            <w:r>
+              <w:t xml:space="preserve">io.github.mrjohn6774.skypulse</w:t>
+            </w:r>
+          </w:p>
+        </w:tc>
+      </w:tr>
+      <w:tr>
+        <w:tc>
+          <w:p>
+            <w:r>
+              <w:t xml:space="preserve">Source</w:t>
+            </w:r>
+          </w:p>
+        </w:tc>
+        <w:tc>
+          <w:p>
+            <w:r>
+              <w:t xml:space="preserve">https://f-droid.org/packages/io.github.mrjohn6774.skypulse/</w:t>
+            </w:r>
+          </w:p>
+        </w:tc>
+      </w:tr>
+      <w:tr>
+        <w:tc>
+          <w:p>
+            <w:r>
+              <w:t xml:space="preserve">Licence</w:t>
+            </w:r>
+          </w:p>
+        </w:tc>
+        <w:tc>
+          <w:p>
+            <w:r>
+              <w:t xml:space="preserve">GPL-3.0-or-later</w:t>
+            </w:r>
+          </w:p>
+        </w:tc>
+      </w:tr>
+      <w:tr>
+        <w:tc>
+          <w:p>
+            <w:r>
+              <w:t xml:space="preserve">Features</w:t>
+            </w:r>
+          </w:p>
+        </w:tc>
+        <w:tc>
+          <w:p>
+            <w:r>
+              <w:t xml:space="preserve">Decodes 1090 MHz Mode S and ADS-B on the phone from an RTL-SDR, maps the aircraft with offline FIR and TRACON boundaries, and can feed local tools over Beast TCP.</w:t>
+            </w:r>
+          </w:p>
+        </w:tc>
+      </w:tr>
+      <w:tr>
+        <w:tc>
+          <w:p>
+            <w:r>
+              <w:t xml:space="preserve">Rust modules</w:t>
+            </w:r>
+          </w:p>
+        </w:tc>
+        <w:tc>
+          <w:p>
+            <w:r>
+              <w:t xml:space="preserve">opensky, nominatim_cli</w:t>
+            </w:r>
+          </w:p>
+        </w:tc>
+      </w:tr>
+      <w:tr>
+        <w:tc>
+          <w:p>
+            <w:r>
+              <w:t xml:space="preserve">Huntsman commands</w:t>
+            </w:r>
+          </w:p>
+        </w:tc>
+        <w:tc>
+          <w:p>
+            <w:r>
+              <w:t xml:space="preserve">geocode QUERY</w:t>
+            </w:r>
+          </w:p>
+        </w:tc>
+      </w:tr>
+      <w:tr>
+        <w:tc>
+          <w:p>
+            <w:r>
+              <w:t xml:space="preserve">Integration</w:t>
+            </w:r>
+          </w:p>
+        </w:tc>
+        <w:tc>
+          <w:p>
+            <w:r>
+              <w:t xml:space="preserve">CLI (geocode LAT,LON, scan -k geocode), /api/lookup and the Web UI's Place scan; opensky in the module catalogue</w:t>
+            </w:r>
+          </w:p>
+        </w:tc>
+      </w:tr>
+      <w:tr>
+        <w:tc>
+          <w:p>
+            <w:r>
+              <w:t xml:space="preserve">Termux requirements</w:t>
+            </w:r>
+          </w:p>
+        </w:tc>
+        <w:tc>
+          <w:p>
+            <w:r>
+              <w:t xml:space="preserve">None for the OpenSky leg; own-receiver decoding would need an RTL-SDR on USB OTG through termux-usb</w:t>
+            </w:r>
+          </w:p>
+        </w:tc>
+      </w:tr>
+      <w:tr>
+        <w:tc>
+          <w:p>
+            <w:r>
+              <w:t xml:space="preserve">Priority</w:t>
+            </w:r>
+          </w:p>
+        </w:tc>
+        <w:tc>
+          <w:p>
+            <w:r>
+              <w:t xml:space="preserve">P2</w:t>
+            </w:r>
+          </w:p>
+        </w:tc>
+      </w:tr>
+      <w:tr>
+        <w:tc>
+          <w:p>
+            <w:r>
+              <w:t xml:space="preserve">Status</w:t>
+            </w:r>
+          </w:p>
+        </w:tc>
+        <w:tc>
+          <w:p>
+            <w:r>
+              <w:t xml:space="preserve">Partial</w:t>
+            </w:r>
+          </w:p>
+        </w:tc>
+      </w:tr>
+      <w:tr>
+        <w:tc>
+          <w:p>
+            <w:r>
+              <w:t xml:space="preserve">Gap or limit</w:t>
+            </w:r>
+          </w:p>
+        </w:tc>
+        <w:tc>
+          <w:p>
+            <w:r>
+              <w:t xml:space="preserve">Huntsman reads what OpenSky's public receiver network last reported around a point (transponder, callsign, position time, altitude, speed, squawk); it does not decode 1090 MHz itself from an attached SDR.</w:t>
+            </w:r>
+          </w:p>
+        </w:tc>
+      </w:tr>
+      <w:tr>
+        <w:tc>
+          <w:p>
+            <w:r>
+              <w:t xml:space="preserve">Acceptance</w:t>
+            </w:r>
+          </w:p>
+        </w:tc>
+        <w:tc>
+          <w:p>
+            <w:r>
+              <w:t xml:space="preserve">geocode LAT,LON lists the aircraft OpenSky reported within half a degree, nearest first, each a transponder DeviceId stating it is an airframe, not anyone aboard, and not where it is now (opensky tests).</w:t>
             </w:r>
           </w:p>
         </w:tc>

</xml_diff>

<commit_message>
Blueprint: aviation category with SkyPulse mapped to the OpenSky leg (#1501)
SkyPulse (F-Droid io.github.mrjohn6774.skypulse, GPL-3.0-or-later), an on-device RTL-SDR ADS-B decoder, is mapped to the opensky leg through `geocode QUERY` as Partial: Huntsman reads what OpenSky's public receiver network reported around a point and does not decode 1090 MHz from an attached SDR. docs/OSINT_APK_BLUEPRINT.docx regenerated (22 tables).

Gated with xtask gate full on the exact head; all CI green on 9c6753a2.

Co-Authored-By: Claude Opus 5.5 <noreply@anthropic.com>
Claude-Session: https://claude.ai/code/session_01UV56qW3Ly33dCiwheMuHej
</commit_message>
<xml_diff>
--- a/docs/OSINT_APK_BLUEPRINT.docx
+++ b/docs/OSINT_APK_BLUEPRINT.docx
@@ -846,6 +846,43 @@
           </w:p>
         </w:tc>
       </w:tr>
+      <w:tr>
+        <w:tc>
+          <w:p>
+            <w:r>
+              <w:t xml:space="preserve">SkyPulse</w:t>
+            </w:r>
+          </w:p>
+        </w:tc>
+        <w:tc>
+          <w:p>
+            <w:r>
+              <w:t xml:space="preserve">Aviation</w:t>
+            </w:r>
+          </w:p>
+        </w:tc>
+        <w:tc>
+          <w:p>
+            <w:r>
+              <w:t xml:space="preserve">P2</w:t>
+            </w:r>
+          </w:p>
+        </w:tc>
+        <w:tc>
+          <w:p>
+            <w:r>
+              <w:t xml:space="preserve">Partial</w:t>
+            </w:r>
+          </w:p>
+        </w:tc>
+        <w:tc>
+          <w:p>
+            <w:r>
+              <w:t xml:space="preserve">geocode QUERY</w:t>
+            </w:r>
+          </w:p>
+        </w:tc>
+      </w:tr>
     </w:tbl>
     <w:p/>
     <w:p>
@@ -5774,6 +5811,257 @@
           <w:p>
             <w:r>
               <w:t xml:space="preserve">crypto BITCOIN-ADDRESS on a fictional fixture lists the sampled first and last transaction times and paid_by, paid_to and co_input counterparties, each stating that a shared transaction is not common ownership (blockchain tests).</w:t>
+            </w:r>
+          </w:p>
+        </w:tc>
+      </w:tr>
+    </w:tbl>
+    <w:p/>
+    <w:p>
+      <w:pPr>
+        <w:pStyle w:val="Heading1"/>
+      </w:pPr>
+      <w:r>
+        <w:t xml:space="preserve">Aviation</w:t>
+      </w:r>
+    </w:p>
+    <w:p>
+      <w:pPr>
+        <w:pStyle w:val="Heading2"/>
+      </w:pPr>
+      <w:r>
+        <w:t xml:space="preserve">SkyPulse</w:t>
+      </w:r>
+    </w:p>
+    <w:tbl>
+      <w:tblPr>
+        <w:tblStyle w:val="Grid"/>
+        <w:tblW w:w="5000" w:type="pct"/>
+        <w:tblLayout w:type="fixed"/>
+      </w:tblPr>
+      <w:tblGrid>
+        <w:gridCol w:w="3443"/>
+        <w:gridCol w:w="11694"/>
+      </w:tblGrid>
+      <w:tr>
+        <w:trPr>
+          <w:tblHeader/>
+        </w:trPr>
+        <w:tc>
+          <w:tcPr>
+            <w:shd w:val="clear" w:color="auto" w:fill="E8EEF7"/>
+          </w:tcPr>
+          <w:p>
+            <w:r>
+              <w:rPr>
+                <w:b/>
+              </w:rPr>
+              <w:t xml:space="preserve">Field</w:t>
+            </w:r>
+          </w:p>
+        </w:tc>
+        <w:tc>
+          <w:tcPr>
+            <w:shd w:val="clear" w:color="auto" w:fill="E8EEF7"/>
+          </w:tcPr>
+          <w:p>
+            <w:r>
+              <w:rPr>
+                <w:b/>
+              </w:rPr>
+              <w:t xml:space="preserve">Value</w:t>
+            </w:r>
+          </w:p>
+        </w:tc>
+      </w:tr>
+      <w:tr>
+        <w:tc>
+          <w:p>
+            <w:r>
+              <w:t xml:space="preserve">Package</w:t>
+            </w:r>
+          </w:p>
+        </w:tc>
+        <w:tc>
+          <w:p>
+            <w:r>
+              <w:t xml:space="preserve">io.github.mrjohn6774.skypulse</w:t>
+            </w:r>
+          </w:p>
+        </w:tc>
+      </w:tr>
+      <w:tr>
+        <w:tc>
+          <w:p>
+            <w:r>
+              <w:t xml:space="preserve">Source</w:t>
+            </w:r>
+          </w:p>
+        </w:tc>
+        <w:tc>
+          <w:p>
+            <w:r>
+              <w:t xml:space="preserve">https://f-droid.org/packages/io.github.mrjohn6774.skypulse/</w:t>
+            </w:r>
+          </w:p>
+        </w:tc>
+      </w:tr>
+      <w:tr>
+        <w:tc>
+          <w:p>
+            <w:r>
+              <w:t xml:space="preserve">Licence</w:t>
+            </w:r>
+          </w:p>
+        </w:tc>
+        <w:tc>
+          <w:p>
+            <w:r>
+              <w:t xml:space="preserve">GPL-3.0-or-later</w:t>
+            </w:r>
+          </w:p>
+        </w:tc>
+      </w:tr>
+      <w:tr>
+        <w:tc>
+          <w:p>
+            <w:r>
+              <w:t xml:space="preserve">Features</w:t>
+            </w:r>
+          </w:p>
+        </w:tc>
+        <w:tc>
+          <w:p>
+            <w:r>
+              <w:t xml:space="preserve">Decodes 1090 MHz Mode S and ADS-B on the phone from an RTL-SDR, maps the aircraft with offline FIR and TRACON boundaries, and can feed local tools over Beast TCP.</w:t>
+            </w:r>
+          </w:p>
+        </w:tc>
+      </w:tr>
+      <w:tr>
+        <w:tc>
+          <w:p>
+            <w:r>
+              <w:t xml:space="preserve">Rust modules</w:t>
+            </w:r>
+          </w:p>
+        </w:tc>
+        <w:tc>
+          <w:p>
+            <w:r>
+              <w:t xml:space="preserve">opensky, nominatim_cli</w:t>
+            </w:r>
+          </w:p>
+        </w:tc>
+      </w:tr>
+      <w:tr>
+        <w:tc>
+          <w:p>
+            <w:r>
+              <w:t xml:space="preserve">Huntsman commands</w:t>
+            </w:r>
+          </w:p>
+        </w:tc>
+        <w:tc>
+          <w:p>
+            <w:r>
+              <w:t xml:space="preserve">geocode QUERY</w:t>
+            </w:r>
+          </w:p>
+        </w:tc>
+      </w:tr>
+      <w:tr>
+        <w:tc>
+          <w:p>
+            <w:r>
+              <w:t xml:space="preserve">Integration</w:t>
+            </w:r>
+          </w:p>
+        </w:tc>
+        <w:tc>
+          <w:p>
+            <w:r>
+              <w:t xml:space="preserve">CLI (geocode LAT,LON, scan -k geocode), /api/lookup and the Web UI's Place scan; opensky in the module catalogue</w:t>
+            </w:r>
+          </w:p>
+        </w:tc>
+      </w:tr>
+      <w:tr>
+        <w:tc>
+          <w:p>
+            <w:r>
+              <w:t xml:space="preserve">Termux requirements</w:t>
+            </w:r>
+          </w:p>
+        </w:tc>
+        <w:tc>
+          <w:p>
+            <w:r>
+              <w:t xml:space="preserve">None for the OpenSky leg; own-receiver decoding would need an RTL-SDR on USB OTG through termux-usb</w:t>
+            </w:r>
+          </w:p>
+        </w:tc>
+      </w:tr>
+      <w:tr>
+        <w:tc>
+          <w:p>
+            <w:r>
+              <w:t xml:space="preserve">Priority</w:t>
+            </w:r>
+          </w:p>
+        </w:tc>
+        <w:tc>
+          <w:p>
+            <w:r>
+              <w:t xml:space="preserve">P2</w:t>
+            </w:r>
+          </w:p>
+        </w:tc>
+      </w:tr>
+      <w:tr>
+        <w:tc>
+          <w:p>
+            <w:r>
+              <w:t xml:space="preserve">Status</w:t>
+            </w:r>
+          </w:p>
+        </w:tc>
+        <w:tc>
+          <w:p>
+            <w:r>
+              <w:t xml:space="preserve">Partial</w:t>
+            </w:r>
+          </w:p>
+        </w:tc>
+      </w:tr>
+      <w:tr>
+        <w:tc>
+          <w:p>
+            <w:r>
+              <w:t xml:space="preserve">Gap or limit</w:t>
+            </w:r>
+          </w:p>
+        </w:tc>
+        <w:tc>
+          <w:p>
+            <w:r>
+              <w:t xml:space="preserve">Huntsman reads what OpenSky's public receiver network last reported around a point (transponder, callsign, position time, altitude, speed, squawk); it does not decode 1090 MHz itself from an attached SDR.</w:t>
+            </w:r>
+          </w:p>
+        </w:tc>
+      </w:tr>
+      <w:tr>
+        <w:tc>
+          <w:p>
+            <w:r>
+              <w:t xml:space="preserve">Acceptance</w:t>
+            </w:r>
+          </w:p>
+        </w:tc>
+        <w:tc>
+          <w:p>
+            <w:r>
+              <w:t xml:space="preserve">geocode LAT,LON lists the aircraft OpenSky reported within half a degree, nearest first, each a transponder DeviceId stating it is an airframe, not anyone aboard, and not where it is now (opensky tests).</w:t>
             </w:r>
           </w:p>
         </w:tc>

</xml_diff>